<commit_message>
improved guiderails for how and when edit_docx is invoked
</commit_message>
<xml_diff>
--- a/artifacts/generated_files/Lesson_plan_FILLED_.docx
+++ b/artifacts/generated_files/Lesson_plan_FILLED_.docx
@@ -72,8 +72,13 @@
         <w:shd w:fill="auto" w:val="clear"/>
         <w:rPr/>
       </w:pPr>
-      <w:r>
-        <w:t>Math – 2nd Period: Multiplication (9s Facts)</w:t>
+      <w:bookmarkStart w:colFirst="0" w:colLast="0" w:name="_az97se5ul39q" w:id="0"/>
+      <w:bookmarkEnd w:id="0"/>
+      <w:r>
+        <w:rPr>
+          <w:rtl w:val="0"/>
+        </w:rPr>
+        <w:t xml:space="preserve">Math – 1st Period</w:t>
       </w:r>
     </w:p>
     <w:p>
@@ -127,7 +132,7 @@
         </w:rPr>
       </w:pPr>
       <w:r>
-        <w:t xml:space="preserve">Teacher: </w:t>
+        <w:t>Teacher: Alex Rivera</w:t>
       </w:r>
     </w:p>
     <w:p>
@@ -148,7 +153,7 @@
         </w:rPr>
       </w:pPr>
       <w:r>
-        <w:t xml:space="preserve">Date: </w:t>
+        <w:t>Date: December 18, 2025</w:t>
       </w:r>
     </w:p>
     <w:p>
@@ -197,7 +202,7 @@
         </w:rPr>
       </w:pPr>
       <w:r>
-        <w:t>Students will develop fluency with the 9s multiplication facts (1×9 through 12×9) using patterns and visual supports so they can apply these facts in mental math and problem solving.</w:t>
+        <w:t>Students will build conceptual understanding of unit fractions (1/n) as equal parts of a whole using manipulatives and real-life contexts. The lesson connects area models and number lines to support transfer across representations.</w:t>
       </w:r>
     </w:p>
     <w:p>
@@ -221,6 +226,16 @@
           <w:rtl w:val="0"/>
         </w:rPr>
         <w:t xml:space="preserve">Education Standards</w:t>
+      </w:r>
+    </w:p>
+    <w:p>
+      <w:r>
+        <w:t>• CCSS.MATH.PRACTICE.MP4: Model with mathematics.</w:t>
+      </w:r>
+    </w:p>
+    <w:p>
+      <w:r>
+        <w:t>• CCSS.MATH.PRACTICE.MP1: Make sense of problems and persevere in solving them.</w:t>
       </w:r>
     </w:p>
     <w:p>
@@ -241,48 +256,9 @@
         <w:spacing w:before="200" w:lineRule="auto"/>
         <w:ind w:left="720" w:hanging="360"/>
       </w:pPr>
-      <w:r/>
-    </w:p>
-    <w:p>
-      <w:pPr>
-        <w:pageBreakBefore w:val="0"/>
-        <w:numPr>
-          <w:ilvl w:val="0"/>
-          <w:numId w:val="3"/>
-        </w:numPr>
-        <w:pBdr>
-          <w:top w:space="0" w:sz="0" w:val="nil"/>
-          <w:left w:space="0" w:sz="0" w:val="nil"/>
-          <w:bottom w:space="0" w:sz="0" w:val="nil"/>
-          <w:right w:space="0" w:sz="0" w:val="nil"/>
-          <w:between w:space="0" w:sz="0" w:val="nil"/>
-        </w:pBdr>
-        <w:shd w:fill="auto" w:val="clear"/>
-        <w:spacing w:before="0" w:lineRule="auto"/>
-        <w:ind w:left="720" w:hanging="360"/>
-      </w:pPr>
-      <w:r/>
-    </w:p>
-    <w:p>
-      <w:pPr>
-        <w:pageBreakBefore w:val="0"/>
-        <w:numPr>
-          <w:ilvl w:val="0"/>
-          <w:numId w:val="3"/>
-        </w:numPr>
-        <w:pBdr>
-          <w:top w:space="0" w:sz="0" w:val="nil"/>
-          <w:left w:space="0" w:sz="0" w:val="nil"/>
-          <w:bottom w:space="0" w:sz="0" w:val="nil"/>
-          <w:right w:space="0" w:sz="0" w:val="nil"/>
-          <w:between w:space="0" w:sz="0" w:val="nil"/>
-        </w:pBdr>
-        <w:shd w:fill="auto" w:val="clear"/>
-        <w:spacing w:before="0" w:lineRule="auto"/>
-        <w:ind w:left="720" w:hanging="360"/>
-        <w:rPr/>
-      </w:pPr>
-      <w:r/>
+      <w:r>
+        <w:t>CCSS.MATH.CONTENT.3.NF.A.1: Understand a fraction 1/b as one part when a whole is partitioned into b equal parts; understand a fraction a/b as a parts of size 1/b.</w:t>
+      </w:r>
     </w:p>
     <w:p>
       <w:pPr>
@@ -305,6 +281,16 @@
           <w:rtl w:val="0"/>
         </w:rPr>
         <w:t xml:space="preserve">Objectives</w:t>
+      </w:r>
+    </w:p>
+    <w:p>
+      <w:r>
+        <w:t>• Explain why equal parts must be the same size to form equal fractions.</w:t>
+      </w:r>
+    </w:p>
+    <w:p>
+      <w:r>
+        <w:t>• Represent unit fractions with area models and on number lines.</w:t>
       </w:r>
     </w:p>
     <w:p>
@@ -327,53 +313,7 @@
         <w:rPr/>
       </w:pPr>
       <w:r>
-        <w:t>SWBAT recite the 9s multiplication facts from 1×9 to 12×9 with at least 90% accuracy.</w:t>
-      </w:r>
-    </w:p>
-    <w:p>
-      <w:pPr>
-        <w:pageBreakBefore w:val="0"/>
-        <w:numPr>
-          <w:ilvl w:val="0"/>
-          <w:numId w:val="2"/>
-        </w:numPr>
-        <w:pBdr>
-          <w:top w:space="0" w:sz="0" w:val="nil"/>
-          <w:left w:space="0" w:sz="0" w:val="nil"/>
-          <w:bottom w:space="0" w:sz="0" w:val="nil"/>
-          <w:right w:space="0" w:sz="0" w:val="nil"/>
-          <w:between w:space="0" w:sz="0" w:val="nil"/>
-        </w:pBdr>
-        <w:shd w:fill="auto" w:val="clear"/>
-        <w:spacing w:before="0" w:lineRule="auto"/>
-        <w:ind w:left="720" w:hanging="360"/>
-        <w:rPr/>
-      </w:pPr>
-      <w:r>
-        <w:t>SWBAT use patterns (finger trick, tens-minus-one strategy, and repeated addition) to determine an unknown 9s fact.</w:t>
-      </w:r>
-    </w:p>
-    <w:p>
-      <w:pPr>
-        <w:pageBreakBefore w:val="0"/>
-        <w:numPr>
-          <w:ilvl w:val="0"/>
-          <w:numId w:val="2"/>
-        </w:numPr>
-        <w:pBdr>
-          <w:top w:space="0" w:sz="0" w:val="nil"/>
-          <w:left w:space="0" w:sz="0" w:val="nil"/>
-          <w:bottom w:space="0" w:sz="0" w:val="nil"/>
-          <w:right w:space="0" w:sz="0" w:val="nil"/>
-          <w:between w:space="0" w:sz="0" w:val="nil"/>
-        </w:pBdr>
-        <w:shd w:fill="auto" w:val="clear"/>
-        <w:spacing w:before="0" w:lineRule="auto"/>
-        <w:ind w:left="720" w:hanging="360"/>
-        <w:rPr/>
-      </w:pPr>
-      <w:r>
-        <w:t>SWBAT solve one-step word problems that require using 9s multiplication facts.</w:t>
+        <w:t>Define a unit fraction as 1 part of a whole partitioned into n equal parts.</w:t>
       </w:r>
     </w:p>
     <w:p>
@@ -400,96 +340,33 @@
       </w:r>
     </w:p>
     <w:p>
-      <w:pPr>
-        <w:pageBreakBefore w:val="0"/>
-        <w:numPr>
-          <w:ilvl w:val="0"/>
-          <w:numId w:val="4"/>
-        </w:numPr>
-        <w:pBdr>
-          <w:top w:space="0" w:sz="0" w:val="nil"/>
-          <w:left w:space="0" w:sz="0" w:val="nil"/>
-          <w:bottom w:space="0" w:sz="0" w:val="nil"/>
-          <w:right w:space="0" w:sz="0" w:val="nil"/>
-          <w:between w:space="0" w:sz="0" w:val="nil"/>
-        </w:pBdr>
-        <w:shd w:fill="auto" w:val="clear"/>
-        <w:spacing w:before="200" w:lineRule="auto"/>
-        <w:ind w:left="720" w:hanging="360"/>
-        <w:rPr/>
-      </w:pPr>
-      <w:r>
-        <w:t>Whiteboard and markers</w:t>
-      </w:r>
-    </w:p>
-    <w:p>
-      <w:pPr>
-        <w:pageBreakBefore w:val="0"/>
-        <w:numPr>
-          <w:ilvl w:val="0"/>
-          <w:numId w:val="4"/>
-        </w:numPr>
-        <w:pBdr>
-          <w:top w:space="0" w:sz="0" w:val="nil"/>
-          <w:left w:space="0" w:sz="0" w:val="nil"/>
-          <w:bottom w:space="0" w:sz="0" w:val="nil"/>
-          <w:right w:space="0" w:sz="0" w:val="nil"/>
-          <w:between w:space="0" w:sz="0" w:val="nil"/>
-        </w:pBdr>
-        <w:shd w:fill="auto" w:val="clear"/>
-        <w:spacing w:before="0" w:lineRule="auto"/>
-        <w:ind w:left="720" w:hanging="360"/>
-        <w:rPr/>
-      </w:pPr>
-      <w:r>
-        <w:t>Multiplication chart (1–12) for display</w:t>
-      </w:r>
-    </w:p>
-    <w:p>
-      <w:pPr>
-        <w:pStyle w:val="Heading1"/>
-        <w:pageBreakBefore w:val="0"/>
-        <w:pBdr>
-          <w:top w:space="0" w:sz="0" w:val="nil"/>
-          <w:left w:space="0" w:sz="0" w:val="nil"/>
-          <w:bottom w:space="0" w:sz="0" w:val="nil"/>
-          <w:right w:space="0" w:sz="0" w:val="nil"/>
-          <w:between w:space="0" w:sz="0" w:val="nil"/>
-        </w:pBdr>
-        <w:shd w:fill="auto" w:val="clear"/>
-        <w:rPr/>
-      </w:pPr>
-      <w:bookmarkStart w:colFirst="0" w:colLast="0" w:name="_k8kielq9w8wr" w:id="6"/>
-      <w:bookmarkEnd w:id="6"/>
-      <w:r>
-        <w:rPr>
-          <w:rtl w:val="0"/>
-        </w:rPr>
-        <w:t xml:space="preserve">Verification</w:t>
-      </w:r>
-    </w:p>
-    <w:p>
-      <w:pPr>
-        <w:pageBreakBefore w:val="0"/>
-        <w:pBdr>
-          <w:top w:space="0" w:sz="0" w:val="nil"/>
-          <w:left w:space="0" w:sz="0" w:val="nil"/>
-          <w:bottom w:space="0" w:sz="0" w:val="nil"/>
-          <w:right w:space="0" w:sz="0" w:val="nil"/>
-          <w:between w:space="0" w:sz="0" w:val="nil"/>
-        </w:pBdr>
-        <w:shd w:fill="auto" w:val="clear"/>
-        <w:spacing w:before="0" w:lineRule="auto"/>
-        <w:rPr>
-          <w:i w:val="1"/>
-          <w:iCs w:val="1"/>
-          <w:color w:val="666666"/>
-          <w:sz w:val="24"/>
-          <w:szCs w:val="24"/>
-        </w:rPr>
-      </w:pPr>
-      <w:r>
-        <w:t>Teacher circulates during guided and independent practice, asking students to explain how they know each 9s fact, and conducts a quick oral check where students answer random 9s facts.</w:t>
+      <w:r>
+        <w:t>• Projector/slides</w:t>
+      </w:r>
+    </w:p>
+    <w:p>
+      <w:r>
+        <w:t>• Whiteboards and dry-erase markers</w:t>
+      </w:r>
+    </w:p>
+    <w:p>
+      <w:r>
+        <w:t>• Number line handout (0–1, tick marks by eighths)</w:t>
+      </w:r>
+    </w:p>
+    <w:p>
+      <w:r>
+        <w:t>• Exit ticket (3 items): (1) Partition a rectangle into 4 equal parts and shade 1/4. (2) Mark 1/4 and 3/4 on a 0–1 number line. (3) In one sentence, state the rule about equal-sized parts. Collect and sort by correct/partial/needs support.</w:t>
+      </w:r>
+    </w:p>
+    <w:p>
+      <w:r>
+        <w:t>• Turn-and-talk: Partners explain why 1/3 is less than 1/2 using area models; teacher circulates with a 3-point checklist (uses vocabulary; references equal parts; compares sizes correctly).</w:t>
+      </w:r>
+    </w:p>
+    <w:p>
+      <w:r>
+        <w:t>Whiteboard quick checks: Students write the name and symbol of a shown unit fraction (e.g., one-fourth, 1/4) and hold up. Teacher scans for 80%+ accuracy.</w:t>
       </w:r>
     </w:p>
     <w:p>
@@ -511,7 +388,10 @@
         <w:ind w:left="720" w:hanging="360"/>
       </w:pPr>
       <w:r>
-        <w:t>Teacher circulates during guided and independent practice, asking students to explain how they know each 9s fact, and conducts a quick oral check where students answer random 9s facts.</w:t>
+        <w:rPr>
+          <w:rtl w:val="0"/>
+        </w:rPr>
+        <w:t xml:space="preserve">Vivamus ultrices eros nec lectus interdum condimentum.</w:t>
       </w:r>
     </w:p>
     <w:p>
@@ -533,7 +413,10 @@
         <w:ind w:left="720" w:hanging="360"/>
       </w:pPr>
       <w:r>
-        <w:t>Teacher circulates during guided and independent practice, asking students to explain how they know each 9s fact, and conducts a quick oral check where students answer random 9s facts.</w:t>
+        <w:rPr>
+          <w:rtl w:val="0"/>
+        </w:rPr>
+        <w:t xml:space="preserve">Cras vel felis a leo pretium pulvinar.</w:t>
       </w:r>
     </w:p>
     <w:p>
@@ -555,7 +438,10 @@
         <w:ind w:left="720" w:hanging="360"/>
       </w:pPr>
       <w:r>
-        <w:t>Teacher circulates during guided and independent practice, asking students to explain how they know each 9s fact, and conducts a quick oral check where students answer random 9s facts.</w:t>
+        <w:rPr>
+          <w:rtl w:val="0"/>
+        </w:rPr>
+        <w:t xml:space="preserve">Curabitur tincidunt elementum ante</w:t>
       </w:r>
     </w:p>
     <w:p>
@@ -600,7 +486,13 @@
         </w:rPr>
       </w:pPr>
       <w:r>
-        <w:t>Begin with a quick review of skip-counting by 9s using a number line or chart. Model patterns for 9s facts (finger trick, tens-minus-one). Have students practice reciting the 9s facts together, then complete guided practice problems as a class. Students then work independently on 9s fact practice sheets and a few short word problems. Close with a choral recitation of the 9s table and a brief reflection on which strategy helped them most.</w:t>
+        <w:rPr>
+          <w:i w:val="1"/>
+          <w:iCs w:val="1"/>
+          <w:color w:val="666666"/>
+          <w:rtl w:val="0"/>
+        </w:rPr>
+        <w:t xml:space="preserve">Describe activity that will reinforce the lesson</w:t>
       </w:r>
     </w:p>
     <w:p>
@@ -617,7 +509,7 @@
         <w:rPr/>
       </w:pPr>
       <w:r>
-        <w:t>Begin with a quick review of skip-counting by 9s using a number line or chart. Model patterns for 9s facts (finger trick, tens-minus-one). Have students practice reciting the 9s facts together, then complete guided practice problems as a class. Students then work independently on 9s fact practice sheets and a few short word problems. Close with a choral recitation of the 9s table and a brief reflection on which strategy helped them most.</w:t>
+        <w:t>Mini-lesson modeling partitions with fraction strips; guided practice building 1/2, 1/3, and 1/4; students place these on number lines; brief share-out where students justify which unit fraction is largest/smallest and why.</w:t>
       </w:r>
     </w:p>
     <w:p>
@@ -636,52 +528,7 @@
         <w:rPr/>
       </w:pPr>
       <w:r>
-        <w:rPr>
-          <w:sz w:val="28"/>
-          <w:szCs w:val="28"/>
-        </w:rPr>
-        <w:drawing>
-          <wp:inline distB="114300" distT="114300" distL="114300" distR="114300">
-            <wp:extent cx="2751336" cy="280988"/>
-            <wp:effectExtent b="0" l="0" r="0" t="0"/>
-            <wp:docPr descr="page break" id="3" name="image3.png"/>
-            <a:graphic>
-              <a:graphicData uri="http://schemas.openxmlformats.org/drawingml/2006/picture">
-                <pic:pic>
-                  <pic:nvPicPr>
-                    <pic:cNvPr descr="page break" id="0" name="image3.png"/>
-                    <pic:cNvPicPr preferRelativeResize="0"/>
-                  </pic:nvPicPr>
-                  <pic:blipFill>
-                    <a:blip r:embed="rId7"/>
-                    <a:srcRect b="0" l="0" r="0" t="0"/>
-                    <a:stretch>
-                      <a:fillRect/>
-                    </a:stretch>
-                  </pic:blipFill>
-                  <pic:spPr>
-                    <a:xfrm>
-                      <a:off x="0" y="0"/>
-                      <a:ext cx="2751336" cy="280988"/>
-                    </a:xfrm>
-                    <a:prstGeom prst="rect"/>
-                    <a:ln/>
-                  </pic:spPr>
-                </pic:pic>
-              </a:graphicData>
-            </a:graphic>
-          </wp:inline>
-        </w:drawing>
-      </w:r>
-      <w:r>
-        <w:rPr>
-          <w:rtl w:val="0"/>
-        </w:rPr>
-      </w:r>
-    </w:p>
-    <w:p>
-      <w:r>
-        <w:t>Begin with a quick review of skip-counting by 9s using a number line or chart. Model patterns for 9s facts (finger trick, tens-minus-one). Have students practice reciting the 9s facts together, then complete guided practice problems as a class. Students then work independently on 9s fact practice sheets and a few short word problems. Close with a choral recitation of the 9s table and a brief reflection on which strategy helped them most.</w:t>
+        <w:t>Mini-lesson modeling partitions with fraction strips; guided practice building 1/2, 1/3, and 1/4; students place these on number lines; brief share-out where students justify which unit fraction is largest/smallest and why.</w:t>
       </w:r>
     </w:p>
     <w:sectPr>

</xml_diff>